<commit_message>
Remove the burrow address; Privacy Policy lists what is recorded (v0.11.4)
- The household address is gone from the app and API (create form, Burrow
  details, schemas, service, tests). Migration 0047 adds a create-household
  function without it; the column and the old function stay until a second
  migration (0048) drops them after this deploy is live.
- Food search no longer returns created_by_user_id, so nobody can tell who added
  a custom food. The database still records it.
- Privacy Policy (October 18, 2026; LEGAL_VERSION 2026-10-18): lists the signup
  acceptance record, the tour-finished marker, that the adding account of a
  custom food is recorded but not shown, and that a custom food stays (unlinked
  from the account) after the account is deleted. Word copy matches.
- README: to-dos for finishing the address removal and for re-matching foods
  whose type is deleted.

Co-Authored-By: Claude Sonnet 5.5 <noreply@anthropic.com>
</commit_message>
<xml_diff>
--- a/legal/Burrow-Privacy-Policy.docx
+++ b/legal/Burrow-Privacy-Policy.docx
@@ -21,7 +21,7 @@
         <w:rPr>
           <w:color w:val="595959"/>
         </w:rPr>
-        <w:t xml:space="preserve">Last updated: October 6, 2026</w:t>
+        <w:t xml:space="preserve">Last updated: October 18, 2026</w:t>
       </w:r>
     </w:p>
     <w:p>
@@ -77,7 +77,7 @@
         <w:t xml:space="preserve">Profile information:</w:t>
       </w:r>
       <w:r>
-        <w:t xml:space="preserve"> a nickname you choose for each household you join, and your role (admin or regular member).</w:t>
+        <w:t xml:space="preserve"> a nickname you choose for each household you join, your role (admin or regular member), and whether you have finished the in-app tour.</w:t>
       </w:r>
     </w:p>
     <w:p>
@@ -94,10 +94,30 @@
           <w:b/>
           <w:bCs/>
         </w:rPr>
+        <w:t xml:space="preserve">Acceptance records:</w:t>
+      </w:r>
+      <w:r>
+        <w:t xml:space="preserve"> when you sign up, we record that you accepted the Terms of Service and this Privacy Policy (which version, and the date and time) and that you confirmed your age or your parent's or guardian's permission.</w:t>
+      </w:r>
+    </w:p>
+    <w:p>
+      <w:pPr>
+        <w:pStyle w:val="ListParagraph"/>
+        <w:numPr>
+          <w:ilvl w:val="0"/>
+          <w:numId w:val="2"/>
+        </w:numPr>
+        <w:spacing w:after="80" w:line="276"/>
+      </w:pPr>
+      <w:r>
+        <w:rPr>
+          <w:b/>
+          <w:bCs/>
+        </w:rPr>
         <w:t xml:space="preserve">Household data you or your household members enter:</w:t>
       </w:r>
       <w:r>
-        <w:t xml:space="preserve"> foods and inventory items, quantities, units, costs, expiry dates, storage locations, who bought and who may use an item, shopping lists, recipes, usage and consumption logs, and the resulting balances and settlements between members.</w:t>
+        <w:t xml:space="preserve"> foods and inventory items, quantities, units, costs, expiry dates, storage locations, who bought and who may use an item, shopping lists, recipes, usage and consumption logs, and the resulting balances and settlements between members. If you add a custom food to Burrow's shared food list, we also record which account added it; this is not shown to other users.</w:t>
       </w:r>
     </w:p>
     <w:p>
@@ -846,6 +866,26 @@
       </w:r>
       <w:r>
         <w:t xml:space="preserve"> your household memberships are deactivated, but the nickname you used and the records tied to it (purchases, usage, cost splits, settlements and activity entries) remain in the household's history, so other members' balances and records stay accurate. After deletion these are no longer linked to a login or an email address, but your nickname may still appear in them. If you want a nickname changed before you leave, do that first.</w:t>
+      </w:r>
+    </w:p>
+    <w:p>
+      <w:pPr>
+        <w:pStyle w:val="ListParagraph"/>
+        <w:numPr>
+          <w:ilvl w:val="0"/>
+          <w:numId w:val="2"/>
+        </w:numPr>
+        <w:spacing w:after="80" w:line="276"/>
+      </w:pPr>
+      <w:r>
+        <w:rPr>
+          <w:b/>
+          <w:bCs/>
+        </w:rPr>
+        <w:t xml:space="preserve">Shared foods you added:</w:t>
+      </w:r>
+      <w:r>
+        <w:t xml:space="preserve"> a custom food you added to Burrow's shared food list stays in the list after you delete your account, because other households may be using it. The record of which account added it is cleared, so it is no longer linked to you.</w:t>
       </w:r>
     </w:p>
     <w:p>

</xml_diff>